<commit_message>
Rootworks backup: 2026-07-23 16:28:59
</commit_message>
<xml_diff>
--- a/Clients/Dave.io/Shared/LinkedIn Campaigns/22.7.26 - Hiring Signal.docx
+++ b/Clients/Dave.io/Shared/LinkedIn Campaigns/22.7.26 - Hiring Signal.docx
@@ -2,7 +2,7 @@
 <file path=word/document.xml><?xml version="1.0" encoding="utf-8"?>
 <w:document xmlns:mc="http://schemas.openxmlformats.org/markup-compatibility/2006" xmlns:o="urn:schemas-microsoft-com:office:office" xmlns:r="http://schemas.openxmlformats.org/officeDocument/2006/relationships" xmlns:m="http://schemas.openxmlformats.org/officeDocument/2006/math" xmlns:v="urn:schemas-microsoft-com:vml" xmlns:wp="http://schemas.openxmlformats.org/drawingml/2006/wordprocessingDrawing" xmlns:w10="urn:schemas-microsoft-com:office:word" xmlns:w="http://schemas.openxmlformats.org/wordprocessingml/2006/main" xmlns:wne="http://schemas.microsoft.com/office/word/2006/wordml" xmlns:sl="http://schemas.openxmlformats.org/schemaLibrary/2006/main" xmlns:a="http://schemas.openxmlformats.org/drawingml/2006/main" xmlns:pic="http://schemas.openxmlformats.org/drawingml/2006/picture" xmlns:c="http://schemas.openxmlformats.org/drawingml/2006/chart" xmlns:lc="http://schemas.openxmlformats.org/drawingml/2006/lockedCanvas" xmlns:dgm="http://schemas.openxmlformats.org/drawingml/2006/diagram" xmlns:wps="http://schemas.microsoft.com/office/word/2010/wordprocessingShape" xmlns:wpg="http://schemas.microsoft.com/office/word/2010/wordprocessingGroup" xmlns:w14="http://schemas.microsoft.com/office/word/2010/wordml" xmlns:w15="http://schemas.microsoft.com/office/word/2012/wordml" xmlns:w16="http://schemas.microsoft.com/office/word/2018/wordml" xmlns:w16cex="http://schemas.microsoft.com/office/word/2018/wordml/cex" xmlns:w16cid="http://schemas.microsoft.com/office/word/2016/wordml/cid" xmlns="http://schemas.microsoft.com/office/tasks/2019/documenttasks" xmlns:cr="http://schemas.microsoft.com/office/comments/2020/reactions">
   <w:body>
-    <w:bookmarkStart w:colFirst="0" w:colLast="0" w:name="bookmark=id.fxoae1b3icxx" w:id="0"/>
+    <w:bookmarkStart w:colFirst="0" w:colLast="0" w:name="bookmark=id.duvkl8c9wev2" w:id="0"/>
     <w:bookmarkEnd w:id="0"/>
     <w:p>
       <w:pPr>
@@ -74,7 +74,7 @@
         </w:rPr>
       </w:r>
     </w:p>
-    <w:bookmarkStart w:colFirst="0" w:colLast="0" w:name="bookmark=id.3zfya7ij68y2" w:id="1"/>
+    <w:bookmarkStart w:colFirst="0" w:colLast="0" w:name="bookmark=id.ml528alfy7d9" w:id="1"/>
     <w:bookmarkEnd w:id="1"/>
     <w:p>
       <w:pPr>
@@ -252,68 +252,6 @@
           <w:vertAlign w:val="baseline"/>
           <w:rtl w:val="0"/>
         </w:rPr>
-        <w:t xml:space="preserve">Two versions (A/B):</w:t>
-      </w:r>
-      <w:r>
-        <w:rPr>
-          <w:rFonts w:ascii="Aptos" w:cs="Aptos" w:eastAsia="Aptos" w:hAnsi="Aptos"/>
-          <w:b w:val="0"/>
-          <w:bCs w:val="0"/>
-          <w:i w:val="0"/>
-          <w:iCs w:val="0"/>
-          <w:smallCaps w:val="0"/>
-          <w:strike w:val="0"/>
-          <w:color w:val="000000"/>
-          <w:sz w:val="24"/>
-          <w:szCs w:val="24"/>
-          <w:u w:val="none"/>
-          <w:shd w:fill="auto" w:val="clear"/>
-          <w:vertAlign w:val="baseline"/>
-          <w:rtl w:val="0"/>
-        </w:rPr>
-        <w:t xml:space="preserve"> same pain, two different openings. Version A goes straight at the cost; Version B gives an easy out first. We split the audience and let the replies tell us which wins.</w:t>
-      </w:r>
-    </w:p>
-    <w:p>
-      <w:pPr>
-        <w:keepNext w:val="0"/>
-        <w:keepLines w:val="0"/>
-        <w:pageBreakBefore w:val="0"/>
-        <w:widowControl w:val="1"/>
-        <w:numPr>
-          <w:ilvl w:val="0"/>
-          <w:numId w:val="1"/>
-        </w:numPr>
-        <w:pBdr>
-          <w:top w:space="0" w:sz="0" w:val="nil"/>
-          <w:left w:space="0" w:sz="0" w:val="nil"/>
-          <w:bottom w:space="0" w:sz="0" w:val="nil"/>
-          <w:right w:space="0" w:sz="0" w:val="nil"/>
-          <w:between w:space="0" w:sz="0" w:val="nil"/>
-        </w:pBdr>
-        <w:shd w:fill="auto" w:val="clear"/>
-        <w:spacing w:after="36" w:before="36" w:line="240" w:lineRule="auto"/>
-        <w:ind w:left="720" w:right="0" w:hanging="360"/>
-        <w:jc w:val="left"/>
-        <w:rPr/>
-      </w:pPr>
-      <w:r>
-        <w:rPr>
-          <w:rFonts w:ascii="Aptos" w:cs="Aptos" w:eastAsia="Aptos" w:hAnsi="Aptos"/>
-          <w:b w:val="1"/>
-          <w:bCs w:val="1"/>
-          <w:i w:val="0"/>
-          <w:iCs w:val="0"/>
-          <w:smallCaps w:val="0"/>
-          <w:strike w:val="0"/>
-          <w:color w:val="000000"/>
-          <w:sz w:val="24"/>
-          <w:szCs w:val="24"/>
-          <w:u w:val="none"/>
-          <w:shd w:fill="auto" w:val="clear"/>
-          <w:vertAlign w:val="baseline"/>
-          <w:rtl w:val="0"/>
-        </w:rPr>
         <w:t xml:space="preserve">Personalization:</w:t>
       </w:r>
       <w:r>
@@ -412,7 +350,7 @@
         <w:t xml:space="preserve"> fill in per person.</w:t>
       </w:r>
     </w:p>
-    <w:bookmarkStart w:colFirst="0" w:colLast="0" w:name="bookmark=id.n2txsjdnwdzj" w:id="2"/>
+    <w:bookmarkStart w:colFirst="0" w:colLast="0" w:name="bookmark=id.xtiqzpwnoo3c" w:id="2"/>
     <w:bookmarkEnd w:id="2"/>
     <w:p>
       <w:pPr>
@@ -423,7 +361,7 @@
         <w:rPr>
           <w:rtl w:val="0"/>
         </w:rPr>
-        <w:t xml:space="preserve">Version A — direct</w:t>
+        <w:t xml:space="preserve">The sequence</w:t>
       </w:r>
     </w:p>
     <w:p>
@@ -630,7 +568,7 @@
           <w:vertAlign w:val="baseline"/>
           <w:rtl w:val="0"/>
         </w:rPr>
-        <w:t xml:space="preserve">Hey {{firstName}}, I saw you’re hiring on the infra side. How much of your engineers’ week is actually going to infra right now, instead of building the product?</w:t>
+        <w:t xml:space="preserve">Hey {{firstName}}, I saw you’re hiring on the infra side. Is infra pulling your engineers away from the product right now?</w:t>
       </w:r>
     </w:p>
     <w:p>
@@ -652,6 +590,23 @@
         <w:jc w:val="left"/>
         <w:rPr>
           <w:rFonts w:ascii="Aptos" w:cs="Aptos" w:eastAsia="Aptos" w:hAnsi="Aptos"/>
+          <w:b w:val="0"/>
+          <w:bCs w:val="0"/>
+          <w:i w:val="0"/>
+          <w:iCs w:val="0"/>
+          <w:smallCaps w:val="0"/>
+          <w:strike w:val="0"/>
+          <w:color w:val="000000"/>
+          <w:sz w:val="24"/>
+          <w:szCs w:val="24"/>
+          <w:u w:val="none"/>
+          <w:shd w:fill="auto" w:val="clear"/>
+          <w:vertAlign w:val="baseline"/>
+        </w:rPr>
+      </w:pPr>
+      <w:r>
+        <w:rPr>
+          <w:rFonts w:ascii="Aptos" w:cs="Aptos" w:eastAsia="Aptos" w:hAnsi="Aptos"/>
           <w:b w:val="1"/>
           <w:bCs w:val="1"/>
           <w:i w:val="0"/>
@@ -664,44 +619,9 @@
           <w:u w:val="none"/>
           <w:shd w:fill="auto" w:val="clear"/>
           <w:vertAlign w:val="baseline"/>
-        </w:rPr>
-      </w:pPr>
-      <w:r>
-        <w:rPr>
-          <w:rFonts w:ascii="Aptos" w:cs="Aptos" w:eastAsia="Aptos" w:hAnsi="Aptos"/>
-          <w:b w:val="1"/>
-          <w:bCs w:val="1"/>
-          <w:i w:val="0"/>
-          <w:iCs w:val="0"/>
-          <w:smallCaps w:val="0"/>
-          <w:strike w:val="0"/>
-          <w:color w:val="000000"/>
-          <w:sz w:val="24"/>
-          <w:szCs w:val="24"/>
-          <w:u w:val="none"/>
-          <w:shd w:fill="auto" w:val="clear"/>
-          <w:vertAlign w:val="baseline"/>
           <w:rtl w:val="0"/>
         </w:rPr>
         <w:t xml:space="preserve">Message 2 — follow-up</w:t>
-      </w:r>
-    </w:p>
-    <w:p>
-      <w:pPr>
-        <w:spacing w:after="100" w:before="100" w:lineRule="auto"/>
-        <w:ind w:left="480" w:right="480" w:firstLine="0"/>
-        <w:rPr>
-          <w:b w:val="1"/>
-          <w:bCs w:val="1"/>
-          <w:shd w:fill="ff9900" w:val="clear"/>
-        </w:rPr>
-      </w:pPr>
-      <w:r>
-        <w:rPr>
-          <w:shd w:fill="ff9900" w:val="clear"/>
-          <w:rtl w:val="0"/>
-        </w:rPr>
-        <w:t xml:space="preserve">I’m guessing the deployments and the random fires mostly land on whoever’s closest right now?</w:t>
       </w:r>
       <w:r>
         <w:rPr>
@@ -759,7 +679,32 @@
           <w:vertAlign w:val="baseline"/>
           <w:rtl w:val="0"/>
         </w:rPr>
-        <w:t xml:space="preserve">The deploys, the pipeline, the random fires. I’m guessing all of it lands on the people you’d rather have building the product?</w:t>
+        <w:t xml:space="preserve">I’m guessing your engineers are the ones handling the deployments and the fires </w:t>
+      </w:r>
+      <w:r>
+        <w:rPr>
+          <w:rtl w:val="0"/>
+        </w:rPr>
+        <w:t xml:space="preserve">at the moment</w:t>
+      </w:r>
+      <w:r>
+        <w:rPr>
+          <w:rFonts w:ascii="Aptos" w:cs="Aptos" w:eastAsia="Aptos" w:hAnsi="Aptos"/>
+          <w:b w:val="0"/>
+          <w:bCs w:val="0"/>
+          <w:i w:val="0"/>
+          <w:iCs w:val="0"/>
+          <w:smallCaps w:val="0"/>
+          <w:strike w:val="0"/>
+          <w:color w:val="000000"/>
+          <w:sz w:val="24"/>
+          <w:szCs w:val="24"/>
+          <w:u w:val="none"/>
+          <w:shd w:fill="auto" w:val="clear"/>
+          <w:vertAlign w:val="baseline"/>
+          <w:rtl w:val="0"/>
+        </w:rPr>
+        <w:t xml:space="preserve">?</w:t>
       </w:r>
     </w:p>
     <w:p>
@@ -870,450 +815,7 @@
           <w:vertAlign w:val="baseline"/>
           <w:rtl w:val="0"/>
         </w:rPr>
-        <w:t xml:space="preserve">If it’s handled, ignore me {{firstName}}. If not, we help you scale without adding DevOps headcount, so your engineers stay on the product. Want me to map where it’d help most at {{companyName}}?</w:t>
-      </w:r>
-    </w:p>
-    <w:bookmarkStart w:colFirst="0" w:colLast="0" w:name="bookmark=id.seg5d0jwyny" w:id="3"/>
-    <w:bookmarkEnd w:id="3"/>
-    <w:p>
-      <w:pPr>
-        <w:pStyle w:val="Heading2"/>
-        <w:rPr/>
-      </w:pPr>
-      <w:r>
-        <w:rPr>
-          <w:rtl w:val="0"/>
-        </w:rPr>
-        <w:t xml:space="preserve">Version B — softer open</w:t>
-      </w:r>
-    </w:p>
-    <w:p>
-      <w:pPr>
-        <w:keepNext w:val="0"/>
-        <w:keepLines w:val="0"/>
-        <w:pageBreakBefore w:val="0"/>
-        <w:widowControl w:val="1"/>
-        <w:pBdr>
-          <w:top w:space="0" w:sz="0" w:val="nil"/>
-          <w:left w:space="0" w:sz="0" w:val="nil"/>
-          <w:bottom w:space="0" w:sz="0" w:val="nil"/>
-          <w:right w:space="0" w:sz="0" w:val="nil"/>
-          <w:between w:space="0" w:sz="0" w:val="nil"/>
-        </w:pBdr>
-        <w:shd w:fill="auto" w:val="clear"/>
-        <w:spacing w:after="180" w:before="180" w:line="240" w:lineRule="auto"/>
-        <w:ind w:left="0" w:right="0" w:firstLine="0"/>
-        <w:jc w:val="left"/>
-        <w:rPr>
-          <w:rFonts w:ascii="Aptos" w:cs="Aptos" w:eastAsia="Aptos" w:hAnsi="Aptos"/>
-          <w:b w:val="0"/>
-          <w:bCs w:val="0"/>
-          <w:i w:val="0"/>
-          <w:iCs w:val="0"/>
-          <w:smallCaps w:val="0"/>
-          <w:strike w:val="0"/>
-          <w:color w:val="000000"/>
-          <w:sz w:val="24"/>
-          <w:szCs w:val="24"/>
-          <w:u w:val="none"/>
-          <w:shd w:fill="auto" w:val="clear"/>
-          <w:vertAlign w:val="baseline"/>
-        </w:rPr>
-      </w:pPr>
-      <w:r>
-        <w:rPr>
-          <w:rFonts w:ascii="Aptos" w:cs="Aptos" w:eastAsia="Aptos" w:hAnsi="Aptos"/>
-          <w:b w:val="1"/>
-          <w:bCs w:val="1"/>
-          <w:i w:val="0"/>
-          <w:iCs w:val="0"/>
-          <w:smallCaps w:val="0"/>
-          <w:strike w:val="0"/>
-          <w:color w:val="000000"/>
-          <w:sz w:val="24"/>
-          <w:szCs w:val="24"/>
-          <w:u w:val="none"/>
-          <w:shd w:fill="auto" w:val="clear"/>
-          <w:vertAlign w:val="baseline"/>
-          <w:rtl w:val="0"/>
-        </w:rPr>
-        <w:t xml:space="preserve">Connection request:</w:t>
-      </w:r>
-      <w:r>
-        <w:rPr>
-          <w:rFonts w:ascii="Aptos" w:cs="Aptos" w:eastAsia="Aptos" w:hAnsi="Aptos"/>
-          <w:b w:val="0"/>
-          <w:bCs w:val="0"/>
-          <w:i w:val="0"/>
-          <w:iCs w:val="0"/>
-          <w:smallCaps w:val="0"/>
-          <w:strike w:val="0"/>
-          <w:color w:val="000000"/>
-          <w:sz w:val="24"/>
-          <w:szCs w:val="24"/>
-          <w:u w:val="none"/>
-          <w:shd w:fill="auto" w:val="clear"/>
-          <w:vertAlign w:val="baseline"/>
-          <w:rtl w:val="0"/>
-        </w:rPr>
-        <w:t xml:space="preserve"> </w:t>
-      </w:r>
-      <w:r>
-        <w:rPr>
-          <w:rFonts w:ascii="Aptos" w:cs="Aptos" w:eastAsia="Aptos" w:hAnsi="Aptos"/>
-          <w:b w:val="0"/>
-          <w:bCs w:val="0"/>
-          <w:i w:val="1"/>
-          <w:iCs w:val="1"/>
-          <w:smallCaps w:val="0"/>
-          <w:strike w:val="0"/>
-          <w:color w:val="000000"/>
-          <w:sz w:val="24"/>
-          <w:szCs w:val="24"/>
-          <w:u w:val="none"/>
-          <w:shd w:fill="auto" w:val="clear"/>
-          <w:vertAlign w:val="baseline"/>
-          <w:rtl w:val="0"/>
-        </w:rPr>
-        <w:t xml:space="preserve">(blank — no note)</w:t>
-      </w:r>
-      <w:r>
-        <w:rPr>
-          <w:rtl w:val="0"/>
-        </w:rPr>
-      </w:r>
-    </w:p>
-    <w:p>
-      <w:pPr>
-        <w:keepNext w:val="0"/>
-        <w:keepLines w:val="0"/>
-        <w:pageBreakBefore w:val="0"/>
-        <w:widowControl w:val="1"/>
-        <w:pBdr>
-          <w:top w:space="0" w:sz="0" w:val="nil"/>
-          <w:left w:space="0" w:sz="0" w:val="nil"/>
-          <w:bottom w:space="0" w:sz="0" w:val="nil"/>
-          <w:right w:space="0" w:sz="0" w:val="nil"/>
-          <w:between w:space="0" w:sz="0" w:val="nil"/>
-        </w:pBdr>
-        <w:shd w:fill="auto" w:val="clear"/>
-        <w:spacing w:after="180" w:before="180" w:line="240" w:lineRule="auto"/>
-        <w:ind w:left="0" w:right="0" w:firstLine="0"/>
-        <w:jc w:val="left"/>
-        <w:rPr>
-          <w:rFonts w:ascii="Aptos" w:cs="Aptos" w:eastAsia="Aptos" w:hAnsi="Aptos"/>
-          <w:b w:val="0"/>
-          <w:bCs w:val="0"/>
-          <w:i w:val="0"/>
-          <w:iCs w:val="0"/>
-          <w:smallCaps w:val="0"/>
-          <w:strike w:val="0"/>
-          <w:color w:val="000000"/>
-          <w:sz w:val="24"/>
-          <w:szCs w:val="24"/>
-          <w:u w:val="none"/>
-          <w:shd w:fill="auto" w:val="clear"/>
-          <w:vertAlign w:val="baseline"/>
-        </w:rPr>
-      </w:pPr>
-      <w:r>
-        <w:rPr>
-          <w:rFonts w:ascii="Aptos" w:cs="Aptos" w:eastAsia="Aptos" w:hAnsi="Aptos"/>
-          <w:b w:val="1"/>
-          <w:bCs w:val="1"/>
-          <w:i w:val="0"/>
-          <w:iCs w:val="0"/>
-          <w:smallCaps w:val="0"/>
-          <w:strike w:val="0"/>
-          <w:color w:val="000000"/>
-          <w:sz w:val="24"/>
-          <w:szCs w:val="24"/>
-          <w:u w:val="none"/>
-          <w:shd w:fill="auto" w:val="clear"/>
-          <w:vertAlign w:val="baseline"/>
-          <w:rtl w:val="0"/>
-        </w:rPr>
-        <w:t xml:space="preserve">Message 1 — on accept</w:t>
-      </w:r>
-      <w:r>
-        <w:rPr>
-          <w:rtl w:val="0"/>
-        </w:rPr>
-      </w:r>
-    </w:p>
-    <w:p>
-      <w:pPr>
-        <w:keepNext w:val="0"/>
-        <w:keepLines w:val="0"/>
-        <w:pageBreakBefore w:val="0"/>
-        <w:widowControl w:val="1"/>
-        <w:pBdr>
-          <w:top w:space="0" w:sz="0" w:val="nil"/>
-          <w:left w:space="0" w:sz="0" w:val="nil"/>
-          <w:bottom w:space="0" w:sz="0" w:val="nil"/>
-          <w:right w:space="0" w:sz="0" w:val="nil"/>
-          <w:between w:space="0" w:sz="0" w:val="nil"/>
-        </w:pBdr>
-        <w:shd w:fill="auto" w:val="clear"/>
-        <w:spacing w:after="100" w:before="100" w:line="240" w:lineRule="auto"/>
-        <w:ind w:left="480" w:right="480" w:firstLine="0"/>
-        <w:jc w:val="left"/>
-        <w:rPr>
-          <w:rFonts w:ascii="Aptos" w:cs="Aptos" w:eastAsia="Aptos" w:hAnsi="Aptos"/>
-          <w:b w:val="0"/>
-          <w:bCs w:val="0"/>
-          <w:i w:val="0"/>
-          <w:iCs w:val="0"/>
-          <w:smallCaps w:val="0"/>
-          <w:strike w:val="0"/>
-          <w:color w:val="000000"/>
-          <w:sz w:val="24"/>
-          <w:szCs w:val="24"/>
-          <w:u w:val="none"/>
-          <w:shd w:fill="auto" w:val="clear"/>
-          <w:vertAlign w:val="baseline"/>
-        </w:rPr>
-      </w:pPr>
-      <w:r>
-        <w:rPr>
-          <w:rFonts w:ascii="Aptos" w:cs="Aptos" w:eastAsia="Aptos" w:hAnsi="Aptos"/>
-          <w:b w:val="0"/>
-          <w:bCs w:val="0"/>
-          <w:i w:val="0"/>
-          <w:iCs w:val="0"/>
-          <w:smallCaps w:val="0"/>
-          <w:strike w:val="0"/>
-          <w:color w:val="000000"/>
-          <w:sz w:val="24"/>
-          <w:szCs w:val="24"/>
-          <w:u w:val="none"/>
-          <w:shd w:fill="auto" w:val="clear"/>
-          <w:vertAlign w:val="baseline"/>
-          <w:rtl w:val="0"/>
-        </w:rPr>
-        <w:t xml:space="preserve">Hey {{firstName}}, I saw you’re hiring on the infra side. I might be off here, but is that because infra keeps pulling your devs off the product?</w:t>
-      </w:r>
-    </w:p>
-    <w:p>
-      <w:pPr>
-        <w:keepNext w:val="0"/>
-        <w:keepLines w:val="0"/>
-        <w:pageBreakBefore w:val="0"/>
-        <w:widowControl w:val="1"/>
-        <w:pBdr>
-          <w:top w:space="0" w:sz="0" w:val="nil"/>
-          <w:left w:space="0" w:sz="0" w:val="nil"/>
-          <w:bottom w:space="0" w:sz="0" w:val="nil"/>
-          <w:right w:space="0" w:sz="0" w:val="nil"/>
-          <w:between w:space="0" w:sz="0" w:val="nil"/>
-        </w:pBdr>
-        <w:shd w:fill="auto" w:val="clear"/>
-        <w:spacing w:after="180" w:before="180" w:line="240" w:lineRule="auto"/>
-        <w:ind w:left="0" w:right="0" w:firstLine="0"/>
-        <w:jc w:val="left"/>
-        <w:rPr>
-          <w:rFonts w:ascii="Aptos" w:cs="Aptos" w:eastAsia="Aptos" w:hAnsi="Aptos"/>
-          <w:b w:val="0"/>
-          <w:bCs w:val="0"/>
-          <w:i w:val="0"/>
-          <w:iCs w:val="0"/>
-          <w:smallCaps w:val="0"/>
-          <w:strike w:val="0"/>
-          <w:color w:val="000000"/>
-          <w:sz w:val="24"/>
-          <w:szCs w:val="24"/>
-          <w:u w:val="none"/>
-          <w:shd w:fill="auto" w:val="clear"/>
-          <w:vertAlign w:val="baseline"/>
-        </w:rPr>
-      </w:pPr>
-      <w:r>
-        <w:rPr>
-          <w:rFonts w:ascii="Aptos" w:cs="Aptos" w:eastAsia="Aptos" w:hAnsi="Aptos"/>
-          <w:b w:val="1"/>
-          <w:bCs w:val="1"/>
-          <w:i w:val="0"/>
-          <w:iCs w:val="0"/>
-          <w:smallCaps w:val="0"/>
-          <w:strike w:val="0"/>
-          <w:color w:val="000000"/>
-          <w:sz w:val="24"/>
-          <w:szCs w:val="24"/>
-          <w:u w:val="none"/>
-          <w:shd w:fill="auto" w:val="clear"/>
-          <w:vertAlign w:val="baseline"/>
-          <w:rtl w:val="0"/>
-        </w:rPr>
-        <w:t xml:space="preserve">Message 2 — follow-up</w:t>
-      </w:r>
-      <w:r>
-        <w:rPr>
-          <w:rtl w:val="0"/>
-        </w:rPr>
-      </w:r>
-    </w:p>
-    <w:p>
-      <w:pPr>
-        <w:keepNext w:val="0"/>
-        <w:keepLines w:val="0"/>
-        <w:pageBreakBefore w:val="0"/>
-        <w:widowControl w:val="1"/>
-        <w:pBdr>
-          <w:top w:space="0" w:sz="0" w:val="nil"/>
-          <w:left w:space="0" w:sz="0" w:val="nil"/>
-          <w:bottom w:space="0" w:sz="0" w:val="nil"/>
-          <w:right w:space="0" w:sz="0" w:val="nil"/>
-          <w:between w:space="0" w:sz="0" w:val="nil"/>
-        </w:pBdr>
-        <w:shd w:fill="auto" w:val="clear"/>
-        <w:spacing w:after="100" w:before="100" w:line="240" w:lineRule="auto"/>
-        <w:ind w:left="480" w:right="480" w:firstLine="0"/>
-        <w:jc w:val="left"/>
-        <w:rPr>
-          <w:rFonts w:ascii="Aptos" w:cs="Aptos" w:eastAsia="Aptos" w:hAnsi="Aptos"/>
-          <w:b w:val="0"/>
-          <w:bCs w:val="0"/>
-          <w:i w:val="0"/>
-          <w:iCs w:val="0"/>
-          <w:smallCaps w:val="0"/>
-          <w:strike w:val="0"/>
-          <w:color w:val="000000"/>
-          <w:sz w:val="24"/>
-          <w:szCs w:val="24"/>
-          <w:u w:val="none"/>
-          <w:shd w:fill="auto" w:val="clear"/>
-          <w:vertAlign w:val="baseline"/>
-        </w:rPr>
-      </w:pPr>
-      <w:r>
-        <w:rPr>
-          <w:rFonts w:ascii="Aptos" w:cs="Aptos" w:eastAsia="Aptos" w:hAnsi="Aptos"/>
-          <w:b w:val="0"/>
-          <w:bCs w:val="0"/>
-          <w:i w:val="0"/>
-          <w:iCs w:val="0"/>
-          <w:smallCaps w:val="0"/>
-          <w:strike w:val="0"/>
-          <w:color w:val="000000"/>
-          <w:sz w:val="24"/>
-          <w:szCs w:val="24"/>
-          <w:u w:val="none"/>
-          <w:shd w:fill="auto" w:val="clear"/>
-          <w:vertAlign w:val="baseline"/>
-          <w:rtl w:val="0"/>
-        </w:rPr>
-        <w:t xml:space="preserve">I’m guessing the deploys and the random fires mostly land on whoever’s closest right now?</w:t>
-      </w:r>
-    </w:p>
-    <w:p>
-      <w:pPr>
-        <w:keepNext w:val="0"/>
-        <w:keepLines w:val="0"/>
-        <w:pageBreakBefore w:val="0"/>
-        <w:widowControl w:val="1"/>
-        <w:pBdr>
-          <w:top w:space="0" w:sz="0" w:val="nil"/>
-          <w:left w:space="0" w:sz="0" w:val="nil"/>
-          <w:bottom w:space="0" w:sz="0" w:val="nil"/>
-          <w:right w:space="0" w:sz="0" w:val="nil"/>
-          <w:between w:space="0" w:sz="0" w:val="nil"/>
-        </w:pBdr>
-        <w:shd w:fill="auto" w:val="clear"/>
-        <w:spacing w:after="180" w:before="180" w:line="240" w:lineRule="auto"/>
-        <w:ind w:left="0" w:right="0" w:firstLine="0"/>
-        <w:jc w:val="left"/>
-        <w:rPr>
-          <w:rFonts w:ascii="Aptos" w:cs="Aptos" w:eastAsia="Aptos" w:hAnsi="Aptos"/>
-          <w:b w:val="0"/>
-          <w:bCs w:val="0"/>
-          <w:i w:val="0"/>
-          <w:iCs w:val="0"/>
-          <w:smallCaps w:val="0"/>
-          <w:strike w:val="0"/>
-          <w:color w:val="000000"/>
-          <w:sz w:val="24"/>
-          <w:szCs w:val="24"/>
-          <w:u w:val="none"/>
-          <w:shd w:fill="auto" w:val="clear"/>
-          <w:vertAlign w:val="baseline"/>
-        </w:rPr>
-      </w:pPr>
-      <w:r>
-        <w:rPr>
-          <w:rFonts w:ascii="Aptos" w:cs="Aptos" w:eastAsia="Aptos" w:hAnsi="Aptos"/>
-          <w:b w:val="1"/>
-          <w:bCs w:val="1"/>
-          <w:i w:val="0"/>
-          <w:iCs w:val="0"/>
-          <w:smallCaps w:val="0"/>
-          <w:strike w:val="0"/>
-          <w:color w:val="000000"/>
-          <w:sz w:val="24"/>
-          <w:szCs w:val="24"/>
-          <w:u w:val="none"/>
-          <w:shd w:fill="auto" w:val="clear"/>
-          <w:vertAlign w:val="baseline"/>
-          <w:rtl w:val="0"/>
-        </w:rPr>
-        <w:t xml:space="preserve">Message 3 — close</w:t>
-      </w:r>
-      <w:r>
-        <w:rPr>
-          <w:rtl w:val="0"/>
-        </w:rPr>
-      </w:r>
-    </w:p>
-    <w:p>
-      <w:pPr>
-        <w:keepNext w:val="0"/>
-        <w:keepLines w:val="0"/>
-        <w:pageBreakBefore w:val="0"/>
-        <w:widowControl w:val="1"/>
-        <w:pBdr>
-          <w:top w:space="0" w:sz="0" w:val="nil"/>
-          <w:left w:space="0" w:sz="0" w:val="nil"/>
-          <w:bottom w:space="0" w:sz="0" w:val="nil"/>
-          <w:right w:space="0" w:sz="0" w:val="nil"/>
-          <w:between w:space="0" w:sz="0" w:val="nil"/>
-        </w:pBdr>
-        <w:shd w:fill="auto" w:val="clear"/>
-        <w:spacing w:after="100" w:before="100" w:line="240" w:lineRule="auto"/>
-        <w:ind w:left="480" w:right="480" w:firstLine="0"/>
-        <w:jc w:val="left"/>
-        <w:rPr>
-          <w:rFonts w:ascii="Aptos" w:cs="Aptos" w:eastAsia="Aptos" w:hAnsi="Aptos"/>
-          <w:b w:val="0"/>
-          <w:bCs w:val="0"/>
-          <w:i w:val="0"/>
-          <w:iCs w:val="0"/>
-          <w:smallCaps w:val="0"/>
-          <w:strike w:val="0"/>
-          <w:color w:val="000000"/>
-          <w:sz w:val="24"/>
-          <w:szCs w:val="24"/>
-          <w:u w:val="none"/>
-          <w:shd w:fill="auto" w:val="clear"/>
-          <w:vertAlign w:val="baseline"/>
-        </w:rPr>
-      </w:pPr>
-      <w:r>
-        <w:rPr>
-          <w:rFonts w:ascii="Aptos" w:cs="Aptos" w:eastAsia="Aptos" w:hAnsi="Aptos"/>
-          <w:b w:val="0"/>
-          <w:bCs w:val="0"/>
-          <w:i w:val="0"/>
-          <w:iCs w:val="0"/>
-          <w:smallCaps w:val="0"/>
-          <w:strike w:val="0"/>
-          <w:color w:val="000000"/>
-          <w:sz w:val="24"/>
-          <w:szCs w:val="24"/>
-          <w:u w:val="none"/>
-          <w:shd w:fill="auto" w:val="clear"/>
-          <w:vertAlign w:val="baseline"/>
-          <w:rtl w:val="0"/>
-        </w:rPr>
-        <w:t xml:space="preserve">All good if it’s sorted {{firstName}}. If not, we help you cover infra without the DevOps hire, so your devs stay on the product. Worth a quick look at where it’d save you?</w:t>
+        <w:t xml:space="preserve">If it’s handled, ignore me {{firstName}}. If not, we help you scale without adding DevOps headcount, and your engineers get back to the product. Want to see what that would look like at {{companyName}}?</w:t>
       </w:r>
     </w:p>
     <w:sectPr>
@@ -1917,7 +1419,7 @@
 
 <file path=customXML/item1.xml><?xml version="1.0" encoding="utf-8"?>
 <go:gDocsCustomXmlDataStorage xmlns:go="http://customooxmlschemas.google.com/" xmlns:r="http://schemas.openxmlformats.org/officeDocument/2006/relationships" uri="GoogleDocsCustomDataVersion2">
-  <go:docsCustomData xmlns:go="http://customooxmlschemas.google.com/" roundtripDataSignature="AMtx7mhpCHb5gZfbwDjgsG0aTbH9thnv8Q==">CgMxLjAyD2lkLmZ4b2FlMWIzaWN4eDIPaWQuM3pmeWE3aWo2OHkyMg9pZC5uMnR4c2pkbndkemoyDmlkLnNlZzVkMGp3eW55OAByITFEeTBldFhaU3A2TTN0QnVvdFoybHBMajg1bDhUcnhuNg==</go:docsCustomData>
+  <go:docsCustomData xmlns:go="http://customooxmlschemas.google.com/" roundtripDataSignature="AMtx7mg5XhGe8RgmyIMAGnx3ybTQwbL6bQ==">CgMxLjAyD2lkLmR1dmtsOGM5d2V2MjIPaWQubWw1MjhhbGZ5N2Q5Mg9pZC54dGlxenB3bm9vM2M4AHIhMUR5MGV0WFpTcDZNM3RCdW90WjJscExqODVsOFRyeG42</go:docsCustomData>
 </go:gDocsCustomXmlDataStorage>
 </file>
 

</xml_diff>